<commit_message>
coach transcript + linked citations with previews; Help Me Now is chat-first
- coach: the conversation persists — every exchange stays on screen, the
  composer never disappears, and recent turns are replayed server-side so
  follow-ups ("he's 3") keep their context
- citations carry url + a short gist: titles link out (live research) and
  hovering shows a small preview card of what the source says
- the step card's type scaled down to body size (it's a paragraph, not a
  headline)
- Help Me Now: text chat is now the primary surface (/api/helpnow — same
  co-regulation persona, one tiny step at a time, quiet episode logging);
  the voice experience stays one visible tap away and closes back into
  the chat
</commit_message>
<xml_diff>
--- a/AAR.docx
+++ b/AAR.docx
@@ -38,7 +38,7 @@
           <w:sz-cs w:val="32"/>
           <w:spacing w:val="0"/>
         </w:rPr>
-        <w:t xml:space="preserve"> Compass — a parenting companion for the digital age</w:t>
+        <w:t xml:space="preserve"> Compass, a parenting companion for the digital age</w:t>
       </w:r>
     </w:p>
     <w:p>
@@ -313,7 +313,7 @@
     </w:p>
     <w:p>
       <w:pPr>
-        <w:ind w:left="720" w:first-line="-720"/>
+        <w:ind w:left="720"/>
       </w:pPr>
       <w:r>
         <w:rPr>
@@ -350,7 +350,7 @@
     </w:p>
     <w:p>
       <w:pPr>
-        <w:ind w:left="720" w:first-line="-720"/>
+        <w:ind w:left="720"/>
       </w:pPr>
       <w:r>
         <w:rPr>
@@ -387,7 +387,7 @@
     </w:p>
     <w:p>
       <w:pPr>
-        <w:ind w:left="720" w:first-line="-720"/>
+        <w:ind w:left="720"/>
       </w:pPr>
       <w:r>
         <w:rPr>
@@ -684,7 +684,61 @@
           <w:sz-cs w:val="28"/>
           <w:spacing w:val="0"/>
         </w:rPr>
-        <w:t xml:space="preserve">Runs the coach agent (≤6 tool rounds: read profile → retrieve evidence → search studies → write memory), enforces per-family authorization on every route, streams results</w:t>
+        <w:t xml:space="preserve">Runs the coach agent (≤6 tool rounds: read profile </w:t>
+      </w:r>
+      <w:r>
+        <w:rPr>
+          <w:rFonts w:ascii="Times New Roman" w:hAnsi="Times New Roman" w:cs="Times New Roman"/>
+          <w:sz w:val="28"/>
+          <w:sz-cs w:val="28"/>
+          <w:spacing w:val="0"/>
+        </w:rPr>
+        <w:t xml:space="preserve">→</w:t>
+      </w:r>
+      <w:r>
+        <w:rPr>
+          <w:rFonts w:ascii="Georgia" w:hAnsi="Georgia" w:cs="Georgia"/>
+          <w:sz w:val="28"/>
+          <w:sz-cs w:val="28"/>
+          <w:spacing w:val="0"/>
+        </w:rPr>
+        <w:t xml:space="preserve"> retrieve evidence </w:t>
+      </w:r>
+      <w:r>
+        <w:rPr>
+          <w:rFonts w:ascii="Times New Roman" w:hAnsi="Times New Roman" w:cs="Times New Roman"/>
+          <w:sz w:val="28"/>
+          <w:sz-cs w:val="28"/>
+          <w:spacing w:val="0"/>
+        </w:rPr>
+        <w:t xml:space="preserve">→</w:t>
+      </w:r>
+      <w:r>
+        <w:rPr>
+          <w:rFonts w:ascii="Georgia" w:hAnsi="Georgia" w:cs="Georgia"/>
+          <w:sz w:val="28"/>
+          <w:sz-cs w:val="28"/>
+          <w:spacing w:val="0"/>
+        </w:rPr>
+        <w:t xml:space="preserve"> search studies </w:t>
+      </w:r>
+      <w:r>
+        <w:rPr>
+          <w:rFonts w:ascii="Times New Roman" w:hAnsi="Times New Roman" w:cs="Times New Roman"/>
+          <w:sz w:val="28"/>
+          <w:sz-cs w:val="28"/>
+          <w:spacing w:val="0"/>
+        </w:rPr>
+        <w:t xml:space="preserve">→</w:t>
+      </w:r>
+      <w:r>
+        <w:rPr>
+          <w:rFonts w:ascii="Georgia" w:hAnsi="Georgia" w:cs="Georgia"/>
+          <w:sz w:val="28"/>
+          <w:sz-cs w:val="28"/>
+          <w:spacing w:val="0"/>
+        </w:rPr>
+        <w:t xml:space="preserve"> write memory), enforces per-family authorization on every route, streams results</w:t>
       </w:r>
     </w:p>
     <w:p>
@@ -931,7 +985,7 @@
     </w:p>
     <w:p>
       <w:pPr>
-        <w:ind w:left="720" w:first-line="-720"/>
+        <w:ind w:left="720"/>
       </w:pPr>
       <w:r>
         <w:rPr>
@@ -987,7 +1041,7 @@
     </w:p>
     <w:p>
       <w:pPr>
-        <w:ind w:left="720" w:first-line="-720"/>
+        <w:ind w:left="720"/>
       </w:pPr>
       <w:r>
         <w:rPr>
@@ -1042,7 +1096,7 @@
     </w:p>
     <w:p>
       <w:pPr>
-        <w:ind w:left="720" w:first-line="-720"/>
+        <w:ind w:left="720"/>
       </w:pPr>
       <w:r>
         <w:rPr>
@@ -1098,7 +1152,7 @@
     </w:p>
     <w:p>
       <w:pPr>
-        <w:ind w:left="720" w:first-line="-720"/>
+        <w:ind w:left="720"/>
       </w:pPr>
       <w:r>
         <w:rPr>
@@ -1353,7 +1407,10 @@
         <w:t xml:space="preserve"/>
       </w:r>
     </w:p>
-    <w:sectPr/>
+    <w:sectPr>
+      <w:pgSz w:w="12240" w:h="15840"/>
+      <w:pgMar w:top="1440" w:right="1800" w:bottom="1440" w:left="1800"/>
+    </w:sectPr>
   </w:body>
 </w:document>
 </file>

</xml_diff>